<commit_message>
feat: implement V3 charging order import
</commit_message>
<xml_diff>
--- a/docs/02-完整功能与数据库ER设计_V3.0.docx
+++ b/docs/02-完整功能与数据库ER设计_V3.0.docx
@@ -607,6 +607,12 @@
     <w:p>
       <w:r>
         <w:t>ExpenseEntry 同时保存不可变 applicationScope 与可变 currentTaskId。TASK 批准即归属目标；DAILY 批准先属于公司层，授权可后绑任务，原属性不变。ExpenseAttributionHistory 逐次记录前后任务、原因、操作人、时间；ExpenseReversalLink 连接冲销与原费用，原批准金额不得就地修改。绑定时费用公司车必须匹配目标任务至少一条正式 INTERNAL Participant 的公司车，否则硬拒绝。外协车牌不是公司费用资格。</w:t>
+      </w:r>
+    </w:p>
+    <w:p>
+      <w:pPr/>
+      <w:r>
+        <w:t>ChargingCompany 保存每家公司唯一当前四字段映射及表头列位置；ImportBatch 保存来源系统、原始文件名/哈希/存储键、映射快照、操作人、确认/入账/零元/重复数量和金额；SourceOrder 逐笔保存来源系统＋订单编号类型＋原始订单号、工作表/原始行号、车牌、真实充电时间、金额及可空的 ExpenseEntry 引用。零元订单金额为 0 且 ExpenseEntry 引用为空，仍保留原始文件追溯和正式去重。正金额订单只经统一 ExpenseEntry 入账；自动任务归属写入统一 ExpenseAttributionHistory。</w:t>
       </w:r>
     </w:p>
     <w:p>
@@ -1304,6 +1310,102 @@
           </w:p>
         </w:tc>
       </w:tr>
+      <w:tr>
+        <w:tc>
+          <w:tcPr>
+            <w:tcW w:type="dxa" w:w="3267"/>
+          </w:tcPr>
+          <w:p>
+            <w:r>
+              <w:t>ChargingCompany</w:t>
+            </w:r>
+          </w:p>
+        </w:tc>
+        <w:tc>
+          <w:tcPr>
+            <w:tcW w:type="dxa" w:w="3267"/>
+          </w:tcPr>
+          <w:p>
+            <w:r>
+              <w:t>ImportBatch</w:t>
+            </w:r>
+          </w:p>
+        </w:tc>
+        <w:tc>
+          <w:tcPr>
+            <w:tcW w:type="dxa" w:w="3267"/>
+          </w:tcPr>
+          <w:p>
+            <w:r>
+              <w:t>1:N；公司只保留当前生效的表头及四字段映射，批次冻结当时映射。</w:t>
+            </w:r>
+          </w:p>
+        </w:tc>
+      </w:tr>
+      <w:tr>
+        <w:tc>
+          <w:tcPr>
+            <w:tcW w:type="dxa" w:w="3267"/>
+          </w:tcPr>
+          <w:p>
+            <w:r>
+              <w:t>ImportBatch</w:t>
+            </w:r>
+          </w:p>
+        </w:tc>
+        <w:tc>
+          <w:tcPr>
+            <w:tcW w:type="dxa" w:w="3267"/>
+          </w:tcPr>
+          <w:p>
+            <w:r>
+              <w:t>SourceOrder</w:t>
+            </w:r>
+          </w:p>
+        </w:tc>
+        <w:tc>
+          <w:tcPr>
+            <w:tcW w:type="dxa" w:w="3267"/>
+          </w:tcPr>
+          <w:p>
+            <w:r>
+              <w:t>1:N；每条订单保留原始文件/工作表/行号；重复订单不新增来源事实。</w:t>
+            </w:r>
+          </w:p>
+        </w:tc>
+      </w:tr>
+      <w:tr>
+        <w:tc>
+          <w:tcPr>
+            <w:tcW w:type="dxa" w:w="3267"/>
+          </w:tcPr>
+          <w:p>
+            <w:r>
+              <w:t>SourceOrder</w:t>
+            </w:r>
+          </w:p>
+        </w:tc>
+        <w:tc>
+          <w:tcPr>
+            <w:tcW w:type="dxa" w:w="3267"/>
+          </w:tcPr>
+          <w:p>
+            <w:r>
+              <w:t>ExpenseEntry</w:t>
+            </w:r>
+          </w:p>
+        </w:tc>
+        <w:tc>
+          <w:tcPr>
+            <w:tcW w:type="dxa" w:w="3267"/>
+          </w:tcPr>
+          <w:p>
+            <w:r>
+              <w:t>0..1:1；零元订单不产生费用，正金额订单恰好一笔正式费用。</w:t>
+            </w:r>
+          </w:p>
+        </w:tc>
+      </w:tr>
     </w:tbl>
     <w:p/>
     <w:p>

</xml_diff>